<commit_message>
Bank J.Van Breda: add "offer to complete verification" paragraph to report + message
Add a recommended-path paragraph offering to complete server-side
verification if the program provides read-only test accounts, and to
continue hunting related authenticated surfaces. Mirror a shorter line
into the program message. Applied to both .md and .docx.

Co-Authored-By: Claude Opus 4.8 <noreply@anthropic.com>
Claude-Session: https://claude.ai/code/session_01GoQQnR4cifhjBsDp6UN95q
</commit_message>
<xml_diff>
--- a/intigriti/bank_van_breda/SUBMISSION-01-conversations-xss.docx
+++ b/intigriti/bank_van_breda/SUBMISSION-01-conversations-xss.docx
@@ -1855,6 +1855,29 @@
           <w:szCs w:val="22"/>
         </w:rPr>
         <w:t xml:space="preserve">account onboarding for this program requires Belgian self-employed / entrepreneur / liberal-profession eligibility, which I do not meet as an international researcher, and no self-serve test/sandbox account is available to me. I have separately asked the program whether read-only test credentials can be provided. I am disclosing this now with complete reproduction steps so the team can confirm the escalation directly.</w:t>
+      </w:r>
+    </w:p>
+    <w:p>
+      <w:pPr>
+        <w:spacing w:after="120" w:line="276"/>
+      </w:pPr>
+      <w:r>
+        <w:rPr>
+          <w:rFonts w:ascii="Cambria" w:cs="Cambria" w:eastAsia="Cambria" w:hAnsi="Cambria"/>
+          <w:b/>
+          <w:bCs/>
+          <w:sz w:val="22"/>
+          <w:szCs w:val="22"/>
+        </w:rPr>
+        <w:t xml:space="preserve">Offer to complete verification myself (recommended): </w:t>
+      </w:r>
+      <w:r>
+        <w:rPr>
+          <w:rFonts w:ascii="Cambria" w:cs="Cambria" w:eastAsia="Cambria" w:hAnsi="Cambria"/>
+          <w:sz w:val="22"/>
+          <w:szCs w:val="22"/>
+        </w:rPr>
+        <w:t xml:space="preserve">Verifying the high-severity escalation of this finding requires server-side behaviour that is only observable from an authenticated session — specifically whether message content is sanitised on store/return and whether cross-customer messaging is permitted. If confirming this internally is complex or time-consuming on your side, I would welcome being provided with one or two read-only test/sandbox accounts so I can complete the verification myself, document the full reproduction with evidence, and continue testing the related authenticated surfaces (including the client-supplied AccountID authorization pattern noted above) for further issues. I am happy to work within any constraints you set — a scoped test account, a monitored testing window, or specific hosts — and will test only my own accounts and never touch real customer data.</w:t>
       </w:r>
     </w:p>
     <w:p>

</xml_diff>